<commit_message>
add guest talk ad
</commit_message>
<xml_diff>
--- a/01-design-formal/yourgame.docx
+++ b/01-design-formal/yourgame.docx
@@ -220,21 +220,7 @@
           <w:rFonts w:ascii="David" w:hAnsi="David" w:cs="David" w:hint="cs"/>
           <w:rtl/>
         </w:rPr>
-        <w:t xml:space="preserve">יש לשלוח </w:t>
-      </w:r>
-      <w:r>
-        <w:rPr>
-          <w:rFonts w:ascii="David" w:hAnsi="David" w:cs="David" w:hint="cs"/>
-          <w:rtl/>
-        </w:rPr>
-        <w:t xml:space="preserve">הודעת דואל </w:t>
-      </w:r>
-      <w:r>
-        <w:rPr>
-          <w:rFonts w:ascii="David" w:hAnsi="David" w:cs="David" w:hint="cs"/>
-          <w:rtl/>
-        </w:rPr>
-        <w:t>למתרגל, עם הפרטים הבאים:</w:t>
+        <w:t>יש לשלוח הודעת דואל למתרגל, עם הפרטים הבאים:</w:t>
       </w:r>
     </w:p>
     <w:p>
@@ -662,7 +648,7 @@
           <w:rFonts w:ascii="David" w:hAnsi="David" w:cs="David"/>
           <w:rtl/>
         </w:rPr>
-        <w:t xml:space="preserve">מיצאו ילדים (שלכם או </w:t>
+        <w:t xml:space="preserve">מצאו ילדים (שלכם או </w:t>
       </w:r>
       <w:r>
         <w:rPr>
@@ -1155,7 +1141,7 @@
         <w:pStyle w:val="Textbody"/>
         <w:jc w:val="both"/>
         <w:rPr>
-          <w:rFonts w:ascii="David" w:hAnsi="David" w:cs="David" w:hint="cs"/>
+          <w:rFonts w:ascii="David" w:hAnsi="David" w:cs="David"/>
           <w:rtl/>
         </w:rPr>
       </w:pPr>
@@ -1388,6 +1374,13 @@
       </w:r>
       <w:r>
         <w:rPr>
+          <w:rFonts w:ascii="David" w:hAnsi="David" w:cs="David" w:hint="cs"/>
+          <w:rtl/>
+        </w:rPr>
+        <w:t xml:space="preserve">הנמצאת </w:t>
+      </w:r>
+      <w:r>
+        <w:rPr>
           <w:rFonts w:ascii="David" w:hAnsi="David" w:cs="David"/>
           <w:rtl/>
         </w:rPr>
@@ -1399,18 +1392,18 @@
         </w:rPr>
         <w:t xml:space="preserve"> </w:t>
       </w:r>
-      <w:hyperlink r:id="rId12" w:history="1">
-        <w:r>
-          <w:rPr>
-            <w:rStyle w:val="Hyperlink"/>
-            <w:rFonts w:ascii="David" w:hAnsi="David" w:cs="David"/>
-          </w:rPr>
-          <w:t>formal-elements.md</w:t>
-        </w:r>
-      </w:hyperlink>
-      <w:r>
-        <w:rPr>
-          <w:rFonts w:ascii="David" w:hAnsi="David" w:cs="David"/>
+      <w:r>
+        <w:rPr>
+          <w:b/>
+          <w:bCs/>
+        </w:rPr>
+        <w:t>formal-elements.md</w:t>
+      </w:r>
+      <w:r>
+        <w:rPr>
+          <w:rFonts w:ascii="David" w:hAnsi="David" w:cs="David"/>
+          <w:b/>
+          <w:bCs/>
         </w:rPr>
         <w:t xml:space="preserve"> </w:t>
       </w:r>
@@ -1419,7 +1412,21 @@
           <w:rFonts w:ascii="David" w:hAnsi="David" w:cs="David"/>
           <w:rtl/>
         </w:rPr>
-        <w:t xml:space="preserve"> .  העתיקו את התבנית למאגר החדש שפתחתם, וענו על השאלות בקובץ (החליפו את הטקסט של השאלות בטקסט של התשובות).</w:t>
+        <w:t xml:space="preserve"> </w:t>
+      </w:r>
+      <w:r>
+        <w:rPr>
+          <w:rFonts w:ascii="David" w:hAnsi="David" w:cs="David" w:hint="cs"/>
+          <w:rtl/>
+        </w:rPr>
+        <w:t>בתיקיה של השבוע</w:t>
+      </w:r>
+      <w:r>
+        <w:rPr>
+          <w:rFonts w:ascii="David" w:hAnsi="David" w:cs="David"/>
+          <w:rtl/>
+        </w:rPr>
+        <w:t>.  העתיקו את התבנית למאגר החדש שפתחתם, וענו על השאלות בקובץ (החליפו את הטקסט של השאלות בטקסט של התשובות).</w:t>
       </w:r>
       <w:r>
         <w:rPr>
@@ -1699,7 +1706,6 @@
       <w:pPr>
         <w:pStyle w:val="Heading2"/>
         <w:rPr>
-          <w:rFonts w:hint="cs"/>
           <w:color w:val="auto"/>
           <w:rtl/>
         </w:rPr>
@@ -1812,8 +1818,8 @@
       </w:r>
     </w:p>
     <w:sectPr>
-      <w:headerReference w:type="default" r:id="rId13"/>
-      <w:footerReference w:type="default" r:id="rId14"/>
+      <w:headerReference w:type="default" r:id="rId12"/>
+      <w:footerReference w:type="default" r:id="rId13"/>
       <w:pgSz w:w="11906" w:h="16838"/>
       <w:pgMar w:top="1134" w:right="1134" w:bottom="1134" w:left="1134" w:header="720" w:footer="720" w:gutter="0"/>
       <w:cols w:space="720"/>

</xml_diff>